<commit_message>
feat(4): complete vi du
</commit_message>
<xml_diff>
--- a/buoi-3/22653991_TranTien_B3.docx
+++ b/buoi-3/22653991_TranTien_B3.docx
@@ -992,308 +992,150 @@
       </w:r>
     </w:p>
     <w:p>
-      <w:pPr>
-        <w:rPr>
-          <w:lang/>
-        </w:rPr>
-      </w:pPr>
-      <w:r>
-        <w:rPr>
-          <w:lang/>
-        </w:rPr>
+      <w:r>
         <w:t>clc;</w:t>
       </w:r>
     </w:p>
     <w:p>
-      <w:pPr>
-        <w:rPr>
-          <w:lang/>
-        </w:rPr>
-      </w:pPr>
-      <w:r>
-        <w:rPr>
-          <w:lang/>
-        </w:rPr>
+      <w:r>
         <w:t>clear all;</w:t>
       </w:r>
     </w:p>
     <w:p>
-      <w:pPr>
-        <w:rPr>
-          <w:lang/>
-        </w:rPr>
-      </w:pPr>
-      <w:r>
-        <w:rPr>
-          <w:lang/>
-        </w:rPr>
+      <w:r>
         <w:t>close all;</w:t>
       </w:r>
     </w:p>
     <w:p>
-      <w:pPr>
-        <w:rPr>
-          <w:lang/>
-        </w:rPr>
-      </w:pPr>
-      <w:r>
-        <w:rPr>
-          <w:lang/>
-        </w:rPr>
-        <w:t xml:space="preserve"> </w:t>
-      </w:r>
-    </w:p>
-    <w:p>
-      <w:pPr>
-        <w:rPr>
-          <w:lang/>
-        </w:rPr>
-      </w:pPr>
-      <w:r>
-        <w:rPr>
-          <w:lang/>
-        </w:rPr>
+      <w:r>
+        <w:t xml:space="preserve"> </w:t>
+      </w:r>
+    </w:p>
+    <w:p>
+      <w:r>
         <w:t>w = -pi:0.01:pi;</w:t>
       </w:r>
     </w:p>
     <w:p>
-      <w:pPr>
-        <w:rPr>
-          <w:lang/>
-        </w:rPr>
-      </w:pPr>
-      <w:r>
-        <w:rPr>
-          <w:lang/>
-        </w:rPr>
-        <w:t xml:space="preserve"> </w:t>
-      </w:r>
-    </w:p>
-    <w:p>
-      <w:pPr>
-        <w:rPr>
-          <w:lang w:val="vi-VN"/>
-        </w:rPr>
-      </w:pPr>
-      <w:r>
-        <w:rPr>
-          <w:lang/>
-        </w:rPr>
+      <w:r>
+        <w:t xml:space="preserve"> </w:t>
+      </w:r>
+    </w:p>
+    <w:p>
+      <w:pPr>
+        <w:rPr>
+          <w:lang w:val="vi-VN"/>
+        </w:rPr>
+      </w:pPr>
+      <w:r>
         <w:t>% a.</w:t>
       </w:r>
     </w:p>
     <w:p>
-      <w:pPr>
-        <w:rPr>
-          <w:lang/>
-        </w:rPr>
-      </w:pPr>
-      <w:r>
-        <w:rPr>
-          <w:lang/>
-        </w:rPr>
+      <w:r>
         <w:t>n = -10:10;</w:t>
       </w:r>
     </w:p>
     <w:p>
-      <w:pPr>
-        <w:rPr>
-          <w:lang/>
-        </w:rPr>
-      </w:pPr>
-      <w:r>
-        <w:rPr>
-          <w:lang/>
-        </w:rPr>
+      <w:r>
         <w:t>x = (0.6).^abs(n);</w:t>
       </w:r>
     </w:p>
     <w:p>
-      <w:pPr>
-        <w:rPr>
-          <w:lang/>
-        </w:rPr>
-      </w:pPr>
-      <w:r>
-        <w:rPr>
-          <w:lang/>
-        </w:rPr>
+      <w:r>
         <w:t xml:space="preserve"> X = zeros(size(w));</w:t>
       </w:r>
     </w:p>
     <w:p>
-      <w:pPr>
-        <w:rPr>
-          <w:lang/>
-        </w:rPr>
-      </w:pPr>
-      <w:r>
-        <w:rPr>
-          <w:lang/>
-        </w:rPr>
+      <w:r>
         <w:t>for k = 1:length(w)</w:t>
       </w:r>
     </w:p>
     <w:p>
-      <w:pPr>
-        <w:rPr>
-          <w:lang/>
-        </w:rPr>
-      </w:pPr>
-      <w:r>
-        <w:rPr>
-          <w:lang/>
-        </w:rPr>
+      <w:r>
         <w:t xml:space="preserve">    X(k) = sum(x .* exp(-1j * w(k) * n));</w:t>
       </w:r>
     </w:p>
     <w:p>
-      <w:pPr>
-        <w:rPr>
-          <w:lang/>
-        </w:rPr>
-      </w:pPr>
-      <w:r>
-        <w:rPr>
-          <w:lang/>
-        </w:rPr>
+      <w:r>
         <w:t>end</w:t>
       </w:r>
     </w:p>
     <w:p>
-      <w:pPr>
-        <w:rPr>
-          <w:lang/>
-        </w:rPr>
-      </w:pPr>
-      <w:r>
-        <w:rPr>
-          <w:lang/>
-        </w:rPr>
+      <w:r>
         <w:t>figure(1);</w:t>
       </w:r>
     </w:p>
     <w:p>
-      <w:pPr>
-        <w:rPr>
-          <w:lang/>
-        </w:rPr>
-      </w:pPr>
-      <w:r>
-        <w:rPr>
-          <w:lang/>
-        </w:rPr>
+      <w:r>
         <w:t>subplot(2, 1, 1);</w:t>
       </w:r>
       <w:r>
         <w:t xml:space="preserve"> </w:t>
       </w:r>
       <w:r>
-        <w:rPr>
-          <w:lang/>
-        </w:rPr>
         <w:t>plot(w, abs(X));</w:t>
       </w:r>
       <w:r>
         <w:t xml:space="preserve"> </w:t>
       </w:r>
       <w:r>
-        <w:rPr>
-          <w:lang/>
-        </w:rPr>
         <w:t>title('Magnitude Part');</w:t>
       </w:r>
       <w:r>
         <w:t xml:space="preserve"> </w:t>
       </w:r>
       <w:r>
-        <w:rPr>
-          <w:lang/>
-        </w:rPr>
         <w:t>xlabel('frequency in pi units');</w:t>
       </w:r>
       <w:r>
         <w:t xml:space="preserve"> </w:t>
       </w:r>
       <w:r>
-        <w:rPr>
-          <w:lang/>
-        </w:rPr>
         <w:t>ylabel('Magnitude');</w:t>
       </w:r>
     </w:p>
     <w:p>
-      <w:pPr>
-        <w:rPr>
-          <w:lang/>
-        </w:rPr>
-      </w:pPr>
-      <w:r>
-        <w:rPr>
-          <w:lang/>
-        </w:rPr>
+      <w:r>
         <w:t>subplot(2, 1, 2);</w:t>
       </w:r>
       <w:r>
         <w:t xml:space="preserve"> </w:t>
       </w:r>
       <w:r>
-        <w:rPr>
-          <w:lang/>
-        </w:rPr>
         <w:t>plot(w, angle(X));</w:t>
       </w:r>
       <w:r>
         <w:t xml:space="preserve"> </w:t>
       </w:r>
       <w:r>
-        <w:rPr>
-          <w:lang/>
-        </w:rPr>
         <w:t>title('Phase Part');</w:t>
       </w:r>
       <w:r>
         <w:t xml:space="preserve"> </w:t>
       </w:r>
       <w:r>
-        <w:rPr>
-          <w:lang/>
-        </w:rPr>
         <w:t>xlabel('frequency in pi units');</w:t>
       </w:r>
       <w:r>
         <w:t xml:space="preserve"> </w:t>
       </w:r>
       <w:r>
-        <w:rPr>
-          <w:lang/>
-        </w:rPr>
         <w:t>ylabel('Phase');</w:t>
       </w:r>
     </w:p>
     <w:p>
-      <w:pPr>
-        <w:rPr>
-          <w:lang/>
-        </w:rPr>
-      </w:pPr>
-      <w:r>
-        <w:rPr>
-          <w:lang/>
-        </w:rPr>
-        <w:t xml:space="preserve"> </w:t>
-      </w:r>
-    </w:p>
-    <w:p>
-      <w:pPr>
-        <w:rPr>
-          <w:lang w:val="vi-VN"/>
-        </w:rPr>
-      </w:pPr>
-      <w:r>
-        <w:rPr>
-          <w:lang/>
-        </w:rPr>
+      <w:r>
+        <w:t xml:space="preserve"> </w:t>
+      </w:r>
+    </w:p>
+    <w:p>
+      <w:pPr>
+        <w:rPr>
+          <w:lang w:val="vi-VN"/>
+        </w:rPr>
+      </w:pPr>
+      <w:r>
         <w:t xml:space="preserve">% </w:t>
       </w:r>
       <w:r>
@@ -1304,106 +1146,42 @@
       </w:r>
     </w:p>
     <w:p>
-      <w:pPr>
-        <w:rPr>
-          <w:lang/>
-        </w:rPr>
-      </w:pPr>
-      <w:r>
-        <w:rPr>
-          <w:lang/>
-        </w:rPr>
+      <w:r>
         <w:t>n = 0:20;</w:t>
       </w:r>
     </w:p>
     <w:p>
-      <w:pPr>
-        <w:rPr>
-          <w:lang/>
-        </w:rPr>
-      </w:pPr>
-      <w:r>
-        <w:rPr>
-          <w:lang/>
-        </w:rPr>
+      <w:r>
         <w:t>x = n .* (0.9).^n;</w:t>
       </w:r>
     </w:p>
     <w:p>
-      <w:pPr>
-        <w:rPr>
-          <w:lang/>
-        </w:rPr>
-      </w:pPr>
-      <w:r>
-        <w:rPr>
-          <w:lang/>
-        </w:rPr>
+      <w:r>
         <w:t xml:space="preserve"> X = zeros(size(w));</w:t>
       </w:r>
     </w:p>
     <w:p>
-      <w:pPr>
-        <w:rPr>
-          <w:lang/>
-        </w:rPr>
-      </w:pPr>
-      <w:r>
-        <w:rPr>
-          <w:lang/>
-        </w:rPr>
+      <w:r>
         <w:t>for k = 1:length(w)</w:t>
       </w:r>
     </w:p>
     <w:p>
-      <w:pPr>
-        <w:rPr>
-          <w:lang/>
-        </w:rPr>
-      </w:pPr>
-      <w:r>
-        <w:rPr>
-          <w:lang/>
-        </w:rPr>
+      <w:r>
         <w:t xml:space="preserve">    X(k) = sum(x .* exp(-1j * w(k) * n));</w:t>
       </w:r>
     </w:p>
     <w:p>
-      <w:pPr>
-        <w:rPr>
-          <w:lang/>
-        </w:rPr>
-      </w:pPr>
-      <w:r>
-        <w:rPr>
-          <w:lang/>
-        </w:rPr>
+      <w:r>
         <w:t>end</w:t>
       </w:r>
     </w:p>
     <w:p>
-      <w:pPr>
-        <w:rPr>
-          <w:lang/>
-        </w:rPr>
-      </w:pPr>
-      <w:r>
-        <w:rPr>
-          <w:lang/>
-        </w:rPr>
+      <w:r>
         <w:t>figure(2);</w:t>
       </w:r>
     </w:p>
     <w:p>
-      <w:pPr>
-        <w:rPr>
-          <w:lang/>
-        </w:rPr>
-      </w:pPr>
-      <w:r>
-        <w:rPr>
-          <w:lang/>
-        </w:rPr>
+      <w:r>
         <w:lastRenderedPageBreak/>
         <w:t>subplot(2, 1, 1);</w:t>
       </w:r>
@@ -1411,111 +1189,68 @@
         <w:t xml:space="preserve"> </w:t>
       </w:r>
       <w:r>
-        <w:rPr>
-          <w:lang/>
-        </w:rPr>
         <w:t>plot(w, abs(X));</w:t>
       </w:r>
       <w:r>
         <w:t xml:space="preserve"> </w:t>
       </w:r>
       <w:r>
-        <w:rPr>
-          <w:lang/>
-        </w:rPr>
         <w:t>title('Magnitude Part');</w:t>
       </w:r>
       <w:r>
         <w:t xml:space="preserve"> </w:t>
       </w:r>
       <w:r>
-        <w:rPr>
-          <w:lang/>
-        </w:rPr>
         <w:t>xlabel('frequency in pi units');</w:t>
       </w:r>
       <w:r>
         <w:t xml:space="preserve"> </w:t>
       </w:r>
       <w:r>
-        <w:rPr>
-          <w:lang/>
-        </w:rPr>
         <w:t>ylabel('Magnitude');</w:t>
       </w:r>
     </w:p>
     <w:p>
-      <w:pPr>
-        <w:rPr>
-          <w:lang/>
-        </w:rPr>
-      </w:pPr>
-      <w:r>
-        <w:rPr>
-          <w:lang/>
-        </w:rPr>
+      <w:r>
         <w:t>subplot(2, 1, 2);</w:t>
       </w:r>
       <w:r>
         <w:t xml:space="preserve"> </w:t>
       </w:r>
       <w:r>
-        <w:rPr>
-          <w:lang/>
-        </w:rPr>
         <w:t>plot(w, angle(X));</w:t>
       </w:r>
       <w:r>
         <w:t xml:space="preserve"> </w:t>
       </w:r>
       <w:r>
-        <w:rPr>
-          <w:lang/>
-        </w:rPr>
         <w:t>title('Phase Part');</w:t>
       </w:r>
       <w:r>
         <w:t xml:space="preserve"> </w:t>
       </w:r>
       <w:r>
-        <w:rPr>
-          <w:lang/>
-        </w:rPr>
         <w:t>xlabel('frequency in pi units');</w:t>
       </w:r>
       <w:r>
         <w:t xml:space="preserve"> </w:t>
       </w:r>
       <w:r>
-        <w:rPr>
-          <w:lang/>
-        </w:rPr>
         <w:t>ylabel('Phase');</w:t>
       </w:r>
     </w:p>
     <w:p>
-      <w:pPr>
-        <w:rPr>
-          <w:lang/>
-        </w:rPr>
-      </w:pPr>
-      <w:r>
-        <w:rPr>
-          <w:lang/>
-        </w:rPr>
-        <w:t xml:space="preserve"> </w:t>
-      </w:r>
-    </w:p>
-    <w:p>
-      <w:pPr>
-        <w:rPr>
-          <w:lang w:val="vi-VN"/>
-        </w:rPr>
-      </w:pPr>
-      <w:r>
-        <w:rPr>
-          <w:lang/>
-        </w:rPr>
+      <w:r>
+        <w:t xml:space="preserve"> </w:t>
+      </w:r>
+    </w:p>
+    <w:p>
+      <w:pPr>
+        <w:rPr>
+          <w:lang w:val="vi-VN"/>
+        </w:rPr>
+      </w:pPr>
+      <w:r>
         <w:t xml:space="preserve">% </w:t>
       </w:r>
       <w:r>
@@ -1526,63 +1261,28 @@
       </w:r>
     </w:p>
     <w:p>
-      <w:pPr>
-        <w:rPr>
-          <w:lang/>
-        </w:rPr>
-      </w:pPr>
-      <w:r>
-        <w:rPr>
-          <w:lang/>
-        </w:rPr>
+      <w:r>
         <w:t>n = 0:50;</w:t>
       </w:r>
     </w:p>
     <w:p>
-      <w:pPr>
-        <w:rPr>
-          <w:lang/>
-        </w:rPr>
-      </w:pPr>
-      <w:r>
-        <w:rPr>
-          <w:lang/>
-        </w:rPr>
+      <w:r>
         <w:t>x = (cos(0.5 * pi * n) + 1j * sin(0.5 * pi * n));</w:t>
       </w:r>
     </w:p>
     <w:p>
       <w:r>
-        <w:rPr>
-          <w:lang/>
-        </w:rPr>
         <w:t xml:space="preserve"> X = zeros(size(w));</w:t>
       </w:r>
     </w:p>
     <w:p/>
     <w:p>
-      <w:pPr>
-        <w:rPr>
-          <w:lang/>
-        </w:rPr>
-      </w:pPr>
-      <w:r>
-        <w:rPr>
-          <w:lang/>
-        </w:rPr>
+      <w:r>
         <w:t>for k = 1:length(w)</w:t>
       </w:r>
     </w:p>
     <w:p>
-      <w:pPr>
-        <w:rPr>
-          <w:lang/>
-        </w:rPr>
-      </w:pPr>
-      <w:r>
-        <w:rPr>
-          <w:lang/>
-        </w:rPr>
+      <w:r>
         <w:t xml:space="preserve">    X(k) = sum(x .* exp(-1j * w(k) * n));</w:t>
       </w:r>
     </w:p>
@@ -1591,208 +1291,111 @@
         <w:t>e</w:t>
       </w:r>
       <w:r>
-        <w:rPr>
-          <w:lang/>
-        </w:rPr>
         <w:t>nd</w:t>
       </w:r>
     </w:p>
     <w:p/>
     <w:p>
-      <w:pPr>
-        <w:rPr>
-          <w:lang/>
-        </w:rPr>
-      </w:pPr>
-      <w:r>
-        <w:rPr>
-          <w:lang/>
-        </w:rPr>
+      <w:r>
         <w:t xml:space="preserve"> figure(3);</w:t>
       </w:r>
     </w:p>
     <w:p>
-      <w:pPr>
-        <w:rPr>
-          <w:lang/>
-        </w:rPr>
-      </w:pPr>
-      <w:r>
-        <w:rPr>
-          <w:lang/>
-        </w:rPr>
+      <w:r>
         <w:t>subplot(2, 1, 1);</w:t>
       </w:r>
       <w:r>
         <w:t xml:space="preserve"> </w:t>
       </w:r>
       <w:r>
-        <w:rPr>
-          <w:lang/>
-        </w:rPr>
         <w:t>plot(w, abs(X));</w:t>
       </w:r>
       <w:r>
         <w:t xml:space="preserve"> </w:t>
       </w:r>
       <w:r>
-        <w:rPr>
-          <w:lang/>
-        </w:rPr>
         <w:t>title('Magnitude Part');</w:t>
       </w:r>
       <w:r>
         <w:t xml:space="preserve"> </w:t>
       </w:r>
       <w:r>
-        <w:rPr>
-          <w:lang/>
-        </w:rPr>
         <w:t>xlabel('frequency in pi units');</w:t>
       </w:r>
       <w:r>
         <w:t xml:space="preserve"> </w:t>
       </w:r>
       <w:r>
-        <w:rPr>
-          <w:lang/>
-        </w:rPr>
         <w:t>ylabel('Magnitude');</w:t>
       </w:r>
     </w:p>
     <w:p>
-      <w:pPr>
-        <w:rPr>
-          <w:lang/>
-        </w:rPr>
-      </w:pPr>
-      <w:r>
-        <w:rPr>
-          <w:lang/>
-        </w:rPr>
+      <w:r>
         <w:t>subplot(2, 1, 2);</w:t>
       </w:r>
       <w:r>
         <w:t xml:space="preserve"> </w:t>
       </w:r>
       <w:r>
-        <w:rPr>
-          <w:lang/>
-        </w:rPr>
         <w:t>plot(w, angle(X));</w:t>
       </w:r>
       <w:r>
         <w:t xml:space="preserve"> </w:t>
       </w:r>
       <w:r>
-        <w:rPr>
-          <w:lang/>
-        </w:rPr>
         <w:t>title('Phase Part');</w:t>
       </w:r>
       <w:r>
         <w:t xml:space="preserve"> </w:t>
       </w:r>
       <w:r>
-        <w:rPr>
-          <w:lang/>
-        </w:rPr>
         <w:t>xlabel('frequency in pi units');</w:t>
       </w:r>
       <w:r>
         <w:t xml:space="preserve"> </w:t>
       </w:r>
       <w:r>
-        <w:rPr>
-          <w:lang/>
-        </w:rPr>
         <w:t>ylabel('Phase');</w:t>
       </w:r>
     </w:p>
     <w:p>
-      <w:pPr>
-        <w:rPr>
-          <w:lang/>
-        </w:rPr>
-      </w:pPr>
-      <w:r>
-        <w:rPr>
-          <w:lang/>
-        </w:rPr>
-        <w:t xml:space="preserve"> </w:t>
-      </w:r>
-    </w:p>
-    <w:p>
-      <w:pPr>
-        <w:rPr>
-          <w:lang w:val="vi-VN"/>
-        </w:rPr>
-      </w:pPr>
-      <w:r>
-        <w:rPr>
-          <w:lang/>
-        </w:rPr>
+      <w:r>
+        <w:t xml:space="preserve"> </w:t>
+      </w:r>
+    </w:p>
+    <w:p>
+      <w:pPr>
+        <w:rPr>
+          <w:lang w:val="vi-VN"/>
+        </w:rPr>
+      </w:pPr>
+      <w:r>
         <w:t>% d.</w:t>
       </w:r>
     </w:p>
     <w:p>
-      <w:pPr>
-        <w:rPr>
-          <w:lang/>
-        </w:rPr>
-      </w:pPr>
-      <w:r>
-        <w:rPr>
-          <w:lang/>
-        </w:rPr>
+      <w:r>
         <w:t>n = 0:7;</w:t>
       </w:r>
     </w:p>
     <w:p>
       <w:r>
-        <w:rPr>
-          <w:lang/>
-        </w:rPr>
         <w:t>x = [4, 3, 2, 1, 1, 2, 3, 4];</w:t>
       </w:r>
     </w:p>
     <w:p/>
     <w:p>
-      <w:pPr>
-        <w:rPr>
-          <w:lang/>
-        </w:rPr>
-      </w:pPr>
-      <w:r>
-        <w:rPr>
-          <w:lang/>
-        </w:rPr>
+      <w:r>
         <w:t xml:space="preserve"> X = zeros(size(w));</w:t>
       </w:r>
     </w:p>
     <w:p>
-      <w:pPr>
-        <w:rPr>
-          <w:lang/>
-        </w:rPr>
-      </w:pPr>
-      <w:r>
-        <w:rPr>
-          <w:lang/>
-        </w:rPr>
+      <w:r>
         <w:t>for k = 1:length(w)</w:t>
       </w:r>
     </w:p>
     <w:p>
-      <w:pPr>
-        <w:rPr>
-          <w:lang/>
-        </w:rPr>
-      </w:pPr>
-      <w:r>
-        <w:rPr>
-          <w:lang/>
-        </w:rPr>
+      <w:r>
         <w:t xml:space="preserve">    X(k) = sum(x .* exp(-1j * w(k) * n));</w:t>
       </w:r>
     </w:p>
@@ -1801,122 +1404,71 @@
         <w:t>e</w:t>
       </w:r>
       <w:r>
-        <w:rPr>
-          <w:lang/>
-        </w:rPr>
         <w:t>nd</w:t>
       </w:r>
     </w:p>
     <w:p/>
     <w:p>
-      <w:pPr>
-        <w:rPr>
-          <w:lang/>
-        </w:rPr>
-      </w:pPr>
-      <w:r>
-        <w:rPr>
-          <w:lang/>
-        </w:rPr>
+      <w:r>
         <w:lastRenderedPageBreak/>
         <w:t xml:space="preserve"> figure(4);</w:t>
       </w:r>
     </w:p>
     <w:p>
-      <w:pPr>
-        <w:rPr>
-          <w:lang/>
-        </w:rPr>
-      </w:pPr>
-      <w:r>
-        <w:rPr>
-          <w:lang/>
-        </w:rPr>
+      <w:r>
         <w:t>subplot(2, 1, 1);</w:t>
       </w:r>
       <w:r>
         <w:t xml:space="preserve"> </w:t>
       </w:r>
       <w:r>
-        <w:rPr>
-          <w:lang/>
-        </w:rPr>
         <w:t>plot(w, abs(X));</w:t>
       </w:r>
       <w:r>
         <w:t xml:space="preserve"> </w:t>
       </w:r>
       <w:r>
-        <w:rPr>
-          <w:lang/>
-        </w:rPr>
         <w:t>title('Magnitude Part');</w:t>
       </w:r>
       <w:r>
         <w:t xml:space="preserve"> </w:t>
       </w:r>
       <w:r>
-        <w:rPr>
-          <w:lang/>
-        </w:rPr>
         <w:t>xlabel('frequency in pi units');</w:t>
       </w:r>
       <w:r>
         <w:t xml:space="preserve"> </w:t>
       </w:r>
       <w:r>
-        <w:rPr>
-          <w:lang/>
-        </w:rPr>
         <w:t>ylabel('Magnitude');</w:t>
       </w:r>
     </w:p>
     <w:p>
-      <w:pPr>
-        <w:rPr>
-          <w:lang/>
-        </w:rPr>
-      </w:pPr>
-      <w:r>
-        <w:rPr>
-          <w:lang/>
-        </w:rPr>
+      <w:r>
         <w:t>subplot(2, 1, 2);</w:t>
       </w:r>
       <w:r>
         <w:t xml:space="preserve"> </w:t>
       </w:r>
       <w:r>
-        <w:rPr>
-          <w:lang/>
-        </w:rPr>
         <w:t>plot(w, angle(X));</w:t>
       </w:r>
       <w:r>
         <w:t xml:space="preserve"> </w:t>
       </w:r>
       <w:r>
-        <w:rPr>
-          <w:lang/>
-        </w:rPr>
         <w:t>title('Phase Part');</w:t>
       </w:r>
       <w:r>
         <w:t xml:space="preserve"> </w:t>
       </w:r>
       <w:r>
-        <w:rPr>
-          <w:lang/>
-        </w:rPr>
         <w:t>xlabel('frequency in pi units');</w:t>
       </w:r>
       <w:r>
         <w:t xml:space="preserve"> </w:t>
       </w:r>
       <w:r>
-        <w:rPr>
-          <w:lang/>
-        </w:rPr>
         <w:t>ylabel('Phase');</w:t>
       </w:r>
     </w:p>
@@ -1935,6 +1487,7 @@
       </w:pPr>
       <w:r>
         <w:rPr>
+          <w:noProof/>
           <w:lang w:val="vi-VN"/>
         </w:rPr>
         <w:drawing>
@@ -1997,402 +1550,180 @@
       </w:r>
     </w:p>
     <w:p>
-      <w:pPr>
-        <w:rPr>
-          <w:lang/>
-        </w:rPr>
-      </w:pPr>
-      <w:r>
-        <w:rPr>
-          <w:lang/>
-        </w:rPr>
+      <w:r>
         <w:t>clc;</w:t>
       </w:r>
     </w:p>
     <w:p>
-      <w:pPr>
-        <w:rPr>
-          <w:lang/>
-        </w:rPr>
-      </w:pPr>
-      <w:r>
-        <w:rPr>
-          <w:lang/>
-        </w:rPr>
+      <w:r>
         <w:t>clear all;</w:t>
       </w:r>
     </w:p>
     <w:p>
-      <w:pPr>
-        <w:rPr>
-          <w:lang/>
-        </w:rPr>
-      </w:pPr>
-      <w:r>
-        <w:rPr>
-          <w:lang/>
-        </w:rPr>
+      <w:r>
         <w:t>close all;</w:t>
       </w:r>
     </w:p>
     <w:p>
-      <w:pPr>
-        <w:rPr>
-          <w:lang/>
-        </w:rPr>
-      </w:pPr>
-      <w:r>
-        <w:rPr>
-          <w:lang/>
-        </w:rPr>
-        <w:t xml:space="preserve"> </w:t>
-      </w:r>
-    </w:p>
-    <w:p>
-      <w:pPr>
-        <w:rPr>
-          <w:lang/>
-        </w:rPr>
-      </w:pPr>
-      <w:r>
-        <w:rPr>
-          <w:lang/>
-        </w:rPr>
+      <w:r>
+        <w:t xml:space="preserve"> </w:t>
+      </w:r>
+    </w:p>
+    <w:p>
+      <w:r>
         <w:t>w = 0:0.01:pi;</w:t>
       </w:r>
     </w:p>
     <w:p>
-      <w:pPr>
-        <w:rPr>
-          <w:lang/>
-        </w:rPr>
-      </w:pPr>
-      <w:r>
-        <w:rPr>
-          <w:lang/>
-        </w:rPr>
-        <w:t xml:space="preserve"> </w:t>
-      </w:r>
-    </w:p>
-    <w:p>
-      <w:pPr>
-        <w:rPr>
-          <w:lang/>
-        </w:rPr>
-      </w:pPr>
-      <w:r>
-        <w:rPr>
-          <w:lang/>
-        </w:rPr>
+      <w:r>
+        <w:t xml:space="preserve"> </w:t>
+      </w:r>
+    </w:p>
+    <w:p>
+      <w:r>
         <w:t xml:space="preserve">% a. </w:t>
       </w:r>
     </w:p>
     <w:p>
-      <w:pPr>
-        <w:rPr>
-          <w:lang/>
-        </w:rPr>
-      </w:pPr>
-      <w:r>
-        <w:rPr>
-          <w:lang/>
-        </w:rPr>
+      <w:r>
         <w:t>n = -2:50;</w:t>
       </w:r>
     </w:p>
     <w:p>
-      <w:pPr>
-        <w:rPr>
-          <w:lang/>
-        </w:rPr>
-      </w:pPr>
-      <w:r>
-        <w:rPr>
-          <w:lang/>
-        </w:rPr>
+      <w:r>
         <w:t>x = 2 * (0.5).^n;</w:t>
       </w:r>
     </w:p>
     <w:p>
-      <w:pPr>
-        <w:rPr>
-          <w:lang/>
-        </w:rPr>
-      </w:pPr>
-      <w:r>
-        <w:rPr>
-          <w:lang/>
-        </w:rPr>
+      <w:r>
         <w:t xml:space="preserve"> X = zeros(size(w));</w:t>
       </w:r>
     </w:p>
     <w:p>
-      <w:pPr>
-        <w:rPr>
-          <w:lang/>
-        </w:rPr>
-      </w:pPr>
-      <w:r>
-        <w:rPr>
-          <w:lang/>
-        </w:rPr>
+      <w:r>
         <w:t>for k = 1:length(w)</w:t>
       </w:r>
     </w:p>
     <w:p>
-      <w:pPr>
-        <w:rPr>
-          <w:lang/>
-        </w:rPr>
-      </w:pPr>
-      <w:r>
-        <w:rPr>
-          <w:lang/>
-        </w:rPr>
+      <w:r>
         <w:t xml:space="preserve">    X(k) = sum(x .* exp(-1j * w(k) * n));</w:t>
       </w:r>
     </w:p>
     <w:p>
-      <w:pPr>
-        <w:rPr>
-          <w:lang/>
-        </w:rPr>
-      </w:pPr>
-      <w:r>
-        <w:rPr>
-          <w:lang/>
-        </w:rPr>
+      <w:r>
         <w:t>end</w:t>
       </w:r>
     </w:p>
     <w:p>
-      <w:pPr>
-        <w:rPr>
-          <w:lang/>
-        </w:rPr>
-      </w:pPr>
-      <w:r>
-        <w:rPr>
-          <w:lang/>
-        </w:rPr>
+      <w:r>
         <w:t>figure(1);</w:t>
       </w:r>
     </w:p>
     <w:p>
-      <w:pPr>
-        <w:rPr>
-          <w:lang/>
-        </w:rPr>
-      </w:pPr>
-      <w:r>
-        <w:rPr>
-          <w:lang/>
-        </w:rPr>
+      <w:r>
         <w:t>subplot(2, 1, 1);</w:t>
       </w:r>
       <w:r>
         <w:t xml:space="preserve"> </w:t>
       </w:r>
       <w:r>
-        <w:rPr>
-          <w:lang/>
-        </w:rPr>
         <w:t>plot(w, abs(X));</w:t>
       </w:r>
       <w:r>
         <w:t xml:space="preserve"> </w:t>
       </w:r>
       <w:r>
-        <w:rPr>
-          <w:lang/>
-        </w:rPr>
         <w:t>title('Magnitude Part');</w:t>
       </w:r>
       <w:r>
         <w:t xml:space="preserve"> </w:t>
       </w:r>
       <w:r>
-        <w:rPr>
-          <w:lang/>
-        </w:rPr>
         <w:t>xlabel('frequency in pi units');</w:t>
       </w:r>
       <w:r>
         <w:t xml:space="preserve"> </w:t>
       </w:r>
       <w:r>
-        <w:rPr>
-          <w:lang/>
-        </w:rPr>
         <w:t>ylabel('Magnitude');</w:t>
       </w:r>
     </w:p>
     <w:p>
-      <w:pPr>
-        <w:rPr>
-          <w:lang/>
-        </w:rPr>
-      </w:pPr>
-      <w:r>
-        <w:rPr>
-          <w:lang/>
-        </w:rPr>
+      <w:r>
         <w:t>subplot(2, 1, 2);</w:t>
       </w:r>
       <w:r>
         <w:t xml:space="preserve"> </w:t>
       </w:r>
       <w:r>
-        <w:rPr>
-          <w:lang/>
-        </w:rPr>
         <w:t>plot(w, angle(X));</w:t>
       </w:r>
       <w:r>
         <w:t xml:space="preserve"> </w:t>
       </w:r>
       <w:r>
-        <w:rPr>
-          <w:lang/>
-        </w:rPr>
         <w:t>title('Phase Part');</w:t>
       </w:r>
       <w:r>
         <w:t xml:space="preserve"> </w:t>
       </w:r>
       <w:r>
-        <w:rPr>
-          <w:lang/>
-        </w:rPr>
         <w:t>xlabel('frequency in pi units');</w:t>
       </w:r>
       <w:r>
         <w:t xml:space="preserve"> </w:t>
       </w:r>
       <w:r>
-        <w:rPr>
-          <w:lang/>
-        </w:rPr>
         <w:t>ylabel('Phase');</w:t>
       </w:r>
     </w:p>
     <w:p>
-      <w:pPr>
-        <w:rPr>
-          <w:lang/>
-        </w:rPr>
-      </w:pPr>
-      <w:r>
-        <w:rPr>
-          <w:lang/>
-        </w:rPr>
-        <w:t xml:space="preserve"> </w:t>
-      </w:r>
-    </w:p>
-    <w:p>
-      <w:r>
-        <w:rPr>
-          <w:lang/>
-        </w:rPr>
+      <w:r>
+        <w:t xml:space="preserve"> </w:t>
+      </w:r>
+    </w:p>
+    <w:p>
+      <w:r>
         <w:t>% b.</w:t>
       </w:r>
     </w:p>
     <w:p>
-      <w:pPr>
-        <w:rPr>
-          <w:lang/>
-        </w:rPr>
-      </w:pPr>
-      <w:r>
-        <w:rPr>
-          <w:lang/>
-        </w:rPr>
+      <w:r>
         <w:t>n = -10:10;</w:t>
       </w:r>
     </w:p>
     <w:p>
-      <w:pPr>
-        <w:rPr>
-          <w:lang/>
-        </w:rPr>
-      </w:pPr>
-      <w:r>
-        <w:rPr>
-          <w:lang/>
-        </w:rPr>
+      <w:r>
         <w:t>x = (0.6).^abs(n);</w:t>
       </w:r>
     </w:p>
     <w:p>
-      <w:pPr>
-        <w:rPr>
-          <w:lang/>
-        </w:rPr>
-      </w:pPr>
-      <w:r>
-        <w:rPr>
-          <w:lang/>
-        </w:rPr>
+      <w:r>
         <w:t xml:space="preserve"> X = zeros(size(w));</w:t>
       </w:r>
     </w:p>
     <w:p>
-      <w:pPr>
-        <w:rPr>
-          <w:lang/>
-        </w:rPr>
-      </w:pPr>
-      <w:r>
-        <w:rPr>
-          <w:lang/>
-        </w:rPr>
+      <w:r>
         <w:t>for k = 1:length(w)</w:t>
       </w:r>
     </w:p>
     <w:p>
-      <w:pPr>
-        <w:rPr>
-          <w:lang/>
-        </w:rPr>
-      </w:pPr>
-      <w:r>
-        <w:rPr>
-          <w:lang/>
-        </w:rPr>
+      <w:r>
         <w:t xml:space="preserve">    X(k) = sum(x .* exp(-1j * w(k) * n));</w:t>
       </w:r>
     </w:p>
     <w:p>
       <w:r>
-        <w:rPr>
-          <w:lang/>
-        </w:rPr>
         <w:t>end</w:t>
       </w:r>
     </w:p>
     <w:p>
-      <w:pPr>
-        <w:rPr>
-          <w:lang/>
-        </w:rPr>
-      </w:pPr>
-      <w:r>
-        <w:rPr>
-          <w:lang/>
-        </w:rPr>
+      <w:r>
         <w:t>figure(2);</w:t>
       </w:r>
     </w:p>
     <w:p>
-      <w:pPr>
-        <w:rPr>
-          <w:lang/>
-        </w:rPr>
-      </w:pPr>
-      <w:r>
-        <w:rPr>
-          <w:lang/>
-        </w:rPr>
+      <w:r>
         <w:lastRenderedPageBreak/>
         <w:t>subplot(2, 1, 1);</w:t>
       </w:r>
@@ -2400,321 +1731,166 @@
         <w:t xml:space="preserve"> </w:t>
       </w:r>
       <w:r>
-        <w:rPr>
-          <w:lang/>
-        </w:rPr>
         <w:t>plot(w, abs(X));</w:t>
       </w:r>
       <w:r>
         <w:t xml:space="preserve"> </w:t>
       </w:r>
       <w:r>
-        <w:rPr>
-          <w:lang/>
-        </w:rPr>
         <w:t>title('Magnitude Part');</w:t>
       </w:r>
       <w:r>
         <w:t xml:space="preserve"> </w:t>
       </w:r>
       <w:r>
-        <w:rPr>
-          <w:lang/>
-        </w:rPr>
         <w:t>xlabel('frequency in pi units');</w:t>
       </w:r>
       <w:r>
         <w:t xml:space="preserve"> </w:t>
       </w:r>
       <w:r>
-        <w:rPr>
-          <w:lang/>
-        </w:rPr>
         <w:t>ylabel('Magnitude');</w:t>
       </w:r>
     </w:p>
     <w:p>
-      <w:pPr>
-        <w:rPr>
-          <w:lang/>
-        </w:rPr>
-      </w:pPr>
-      <w:r>
-        <w:rPr>
-          <w:lang/>
-        </w:rPr>
+      <w:r>
         <w:t>subplot(2, 1, 2);</w:t>
       </w:r>
       <w:r>
         <w:t xml:space="preserve"> </w:t>
       </w:r>
       <w:r>
-        <w:rPr>
-          <w:lang/>
-        </w:rPr>
         <w:t>plot(w, angle(X));</w:t>
       </w:r>
       <w:r>
         <w:t xml:space="preserve"> </w:t>
       </w:r>
       <w:r>
-        <w:rPr>
-          <w:lang/>
-        </w:rPr>
         <w:t>title('Phase Part');</w:t>
       </w:r>
       <w:r>
         <w:t xml:space="preserve"> </w:t>
       </w:r>
       <w:r>
-        <w:rPr>
-          <w:lang/>
-        </w:rPr>
         <w:t>xlabel('frequency in pi units');</w:t>
       </w:r>
       <w:r>
         <w:t xml:space="preserve"> </w:t>
       </w:r>
       <w:r>
-        <w:rPr>
-          <w:lang/>
-        </w:rPr>
         <w:t>ylabel('Phase');</w:t>
       </w:r>
     </w:p>
     <w:p>
-      <w:pPr>
-        <w:rPr>
-          <w:lang/>
-        </w:rPr>
-      </w:pPr>
-      <w:r>
-        <w:rPr>
-          <w:lang/>
-        </w:rPr>
-        <w:t xml:space="preserve"> </w:t>
-      </w:r>
-    </w:p>
-    <w:p>
-      <w:pPr>
-        <w:rPr>
-          <w:lang/>
-        </w:rPr>
-      </w:pPr>
-      <w:r>
-        <w:rPr>
-          <w:lang/>
-        </w:rPr>
+      <w:r>
+        <w:t xml:space="preserve"> </w:t>
+      </w:r>
+    </w:p>
+    <w:p>
+      <w:r>
         <w:t xml:space="preserve">% c. </w:t>
       </w:r>
     </w:p>
     <w:p>
-      <w:pPr>
-        <w:rPr>
-          <w:lang/>
-        </w:rPr>
-      </w:pPr>
-      <w:r>
-        <w:rPr>
-          <w:lang/>
-        </w:rPr>
+      <w:r>
         <w:t>n = -3:50;</w:t>
       </w:r>
     </w:p>
     <w:p>
-      <w:pPr>
-        <w:rPr>
-          <w:lang/>
-        </w:rPr>
-      </w:pPr>
-      <w:r>
-        <w:rPr>
-          <w:lang/>
-        </w:rPr>
+      <w:r>
         <w:t>x = n .* (0.9).^n;</w:t>
       </w:r>
     </w:p>
     <w:p>
-      <w:pPr>
-        <w:rPr>
-          <w:lang/>
-        </w:rPr>
-      </w:pPr>
-      <w:r>
-        <w:rPr>
-          <w:lang/>
-        </w:rPr>
+      <w:r>
         <w:t xml:space="preserve"> X = zeros(size(w));</w:t>
       </w:r>
     </w:p>
     <w:p>
-      <w:pPr>
-        <w:rPr>
-          <w:lang/>
-        </w:rPr>
-      </w:pPr>
-      <w:r>
-        <w:rPr>
-          <w:lang/>
-        </w:rPr>
+      <w:r>
         <w:t>for k = 1:length(w)</w:t>
       </w:r>
     </w:p>
     <w:p>
-      <w:pPr>
-        <w:rPr>
-          <w:lang/>
-        </w:rPr>
-      </w:pPr>
-      <w:r>
-        <w:rPr>
-          <w:lang/>
-        </w:rPr>
+      <w:r>
         <w:t xml:space="preserve">    X(k) = sum(x .* exp(-1j * w(k) * n));</w:t>
       </w:r>
     </w:p>
     <w:p>
-      <w:pPr>
-        <w:rPr>
-          <w:lang/>
-        </w:rPr>
-      </w:pPr>
-      <w:r>
-        <w:rPr>
-          <w:lang/>
-        </w:rPr>
+      <w:r>
         <w:t>end</w:t>
       </w:r>
     </w:p>
     <w:p>
-      <w:pPr>
-        <w:rPr>
-          <w:lang/>
-        </w:rPr>
-      </w:pPr>
-      <w:r>
-        <w:rPr>
-          <w:lang/>
-        </w:rPr>
+      <w:r>
         <w:t>figure(3);</w:t>
       </w:r>
     </w:p>
     <w:p>
-      <w:pPr>
-        <w:rPr>
-          <w:lang/>
-        </w:rPr>
-      </w:pPr>
-      <w:r>
-        <w:rPr>
-          <w:lang/>
-        </w:rPr>
+      <w:r>
         <w:t>subplot(2, 1, 1);</w:t>
       </w:r>
       <w:r>
         <w:t xml:space="preserve"> </w:t>
       </w:r>
       <w:r>
-        <w:rPr>
-          <w:lang/>
-        </w:rPr>
         <w:t>plot(w, abs(X));</w:t>
       </w:r>
       <w:r>
         <w:t xml:space="preserve"> </w:t>
       </w:r>
       <w:r>
-        <w:rPr>
-          <w:lang/>
-        </w:rPr>
         <w:t>title('Magnitude Part');</w:t>
       </w:r>
       <w:r>
         <w:t xml:space="preserve"> </w:t>
       </w:r>
       <w:r>
-        <w:rPr>
-          <w:lang/>
-        </w:rPr>
         <w:t>xlabel('frequency in pi units');</w:t>
       </w:r>
       <w:r>
         <w:t xml:space="preserve"> </w:t>
       </w:r>
       <w:r>
-        <w:rPr>
-          <w:lang/>
-        </w:rPr>
         <w:t>ylabel('Magnitude');</w:t>
       </w:r>
     </w:p>
     <w:p>
-      <w:pPr>
-        <w:rPr>
-          <w:lang/>
-        </w:rPr>
-      </w:pPr>
-      <w:r>
-        <w:rPr>
-          <w:lang/>
-        </w:rPr>
+      <w:r>
         <w:t>subplot(2, 1, 2);</w:t>
       </w:r>
       <w:r>
         <w:t xml:space="preserve"> </w:t>
       </w:r>
       <w:r>
-        <w:rPr>
-          <w:lang/>
-        </w:rPr>
         <w:t>plot(w, angle(X));</w:t>
       </w:r>
       <w:r>
         <w:t xml:space="preserve"> </w:t>
       </w:r>
       <w:r>
-        <w:rPr>
-          <w:lang/>
-        </w:rPr>
         <w:t>title('Phase Part');</w:t>
       </w:r>
       <w:r>
         <w:t xml:space="preserve"> </w:t>
       </w:r>
       <w:r>
-        <w:rPr>
-          <w:lang/>
-        </w:rPr>
         <w:t>xlabel('frequency in pi units');</w:t>
       </w:r>
       <w:r>
         <w:t xml:space="preserve"> </w:t>
       </w:r>
       <w:r>
-        <w:rPr>
-          <w:lang/>
-        </w:rPr>
         <w:t>ylabel('Phase');</w:t>
       </w:r>
     </w:p>
     <w:p>
-      <w:pPr>
-        <w:rPr>
-          <w:lang/>
-        </w:rPr>
-      </w:pPr>
-      <w:r>
-        <w:rPr>
-          <w:lang/>
-        </w:rPr>
-        <w:t xml:space="preserve"> </w:t>
-      </w:r>
-    </w:p>
-    <w:p>
-      <w:r>
-        <w:rPr>
-          <w:lang/>
-        </w:rPr>
+      <w:r>
+        <w:t xml:space="preserve"> </w:t>
+      </w:r>
+    </w:p>
+    <w:p>
+      <w:r>
         <w:t>% d</w:t>
       </w:r>
       <w:r>
@@ -2722,213 +1898,106 @@
       </w:r>
     </w:p>
     <w:p>
-      <w:pPr>
-        <w:rPr>
-          <w:lang/>
-        </w:rPr>
-      </w:pPr>
-      <w:r>
-        <w:rPr>
-          <w:lang/>
-        </w:rPr>
+      <w:r>
         <w:t>n = 2:50;</w:t>
       </w:r>
     </w:p>
     <w:p>
-      <w:pPr>
-        <w:rPr>
-          <w:lang/>
-        </w:rPr>
-      </w:pPr>
-      <w:r>
-        <w:rPr>
-          <w:lang/>
-        </w:rPr>
+      <w:r>
         <w:t>x = (n + 3) .* (0.8).^(n - 1);</w:t>
       </w:r>
     </w:p>
     <w:p>
-      <w:pPr>
-        <w:rPr>
-          <w:lang/>
-        </w:rPr>
-      </w:pPr>
-      <w:r>
-        <w:rPr>
-          <w:lang/>
-        </w:rPr>
+      <w:r>
         <w:t xml:space="preserve"> X = zeros(size(w));</w:t>
       </w:r>
     </w:p>
     <w:p>
-      <w:pPr>
-        <w:rPr>
-          <w:lang/>
-        </w:rPr>
-      </w:pPr>
-      <w:r>
-        <w:rPr>
-          <w:lang/>
-        </w:rPr>
+      <w:r>
         <w:t>for k = 1:length(w)</w:t>
       </w:r>
     </w:p>
     <w:p>
-      <w:pPr>
-        <w:rPr>
-          <w:lang/>
-        </w:rPr>
-      </w:pPr>
-      <w:r>
-        <w:rPr>
-          <w:lang/>
-        </w:rPr>
+      <w:r>
         <w:t xml:space="preserve">    X(k) = sum(x .* exp(-1j * w(k) * n));</w:t>
       </w:r>
     </w:p>
     <w:p>
-      <w:pPr>
-        <w:rPr>
-          <w:lang/>
-        </w:rPr>
-      </w:pPr>
-      <w:r>
-        <w:rPr>
-          <w:lang/>
-        </w:rPr>
+      <w:r>
         <w:t>end</w:t>
       </w:r>
     </w:p>
     <w:p>
-      <w:pPr>
-        <w:rPr>
-          <w:lang/>
-        </w:rPr>
-      </w:pPr>
-      <w:r>
-        <w:rPr>
-          <w:lang/>
-        </w:rPr>
+      <w:r>
         <w:t xml:space="preserve"> figure(4);</w:t>
       </w:r>
     </w:p>
     <w:p>
-      <w:pPr>
-        <w:rPr>
-          <w:lang/>
-        </w:rPr>
-      </w:pPr>
-      <w:r>
-        <w:rPr>
-          <w:lang/>
-        </w:rPr>
+      <w:r>
         <w:t>subplot(2, 1, 1);</w:t>
       </w:r>
       <w:r>
         <w:t xml:space="preserve"> </w:t>
       </w:r>
       <w:r>
-        <w:rPr>
-          <w:lang/>
-        </w:rPr>
         <w:t>plot(w, abs(X));</w:t>
       </w:r>
       <w:r>
         <w:t xml:space="preserve"> </w:t>
       </w:r>
       <w:r>
-        <w:rPr>
-          <w:lang/>
-        </w:rPr>
         <w:t>title('Magnitude Part');</w:t>
       </w:r>
       <w:r>
         <w:t xml:space="preserve"> </w:t>
       </w:r>
       <w:r>
-        <w:rPr>
-          <w:lang/>
-        </w:rPr>
         <w:t>xlabel('frequency in pi units');</w:t>
       </w:r>
       <w:r>
         <w:t xml:space="preserve"> </w:t>
       </w:r>
       <w:r>
-        <w:rPr>
-          <w:lang/>
-        </w:rPr>
         <w:t>ylabel('Magnitude');</w:t>
       </w:r>
     </w:p>
     <w:p>
-      <w:pPr>
-        <w:rPr>
-          <w:lang/>
-        </w:rPr>
-      </w:pPr>
-      <w:r>
-        <w:rPr>
-          <w:lang/>
-        </w:rPr>
+      <w:r>
         <w:t>subplot(2, 1, 2);</w:t>
       </w:r>
       <w:r>
         <w:t xml:space="preserve"> </w:t>
       </w:r>
       <w:r>
-        <w:rPr>
-          <w:lang/>
-        </w:rPr>
         <w:t>plot(w, angle(X));</w:t>
       </w:r>
       <w:r>
         <w:t xml:space="preserve"> </w:t>
       </w:r>
       <w:r>
-        <w:rPr>
-          <w:lang/>
-        </w:rPr>
         <w:t>title('Phase Part');</w:t>
       </w:r>
       <w:r>
         <w:t xml:space="preserve"> </w:t>
       </w:r>
       <w:r>
-        <w:rPr>
-          <w:lang/>
-        </w:rPr>
         <w:t>xlabel('frequency in pi units');</w:t>
       </w:r>
       <w:r>
         <w:t xml:space="preserve"> </w:t>
       </w:r>
       <w:r>
-        <w:rPr>
-          <w:lang/>
-        </w:rPr>
         <w:t>ylabel('Phase');</w:t>
       </w:r>
     </w:p>
     <w:p>
-      <w:pPr>
-        <w:rPr>
-          <w:lang/>
-        </w:rPr>
-      </w:pPr>
-      <w:r>
-        <w:rPr>
-          <w:lang/>
-        </w:rPr>
+      <w:r>
         <w:lastRenderedPageBreak/>
         <w:t xml:space="preserve"> </w:t>
       </w:r>
     </w:p>
     <w:p>
       <w:r>
-        <w:rPr>
-          <w:lang/>
-        </w:rPr>
         <w:t>% e</w:t>
       </w:r>
       <w:r>
@@ -2936,191 +2005,95 @@
       </w:r>
     </w:p>
     <w:p>
-      <w:pPr>
-        <w:rPr>
-          <w:lang/>
-        </w:rPr>
-      </w:pPr>
-      <w:r>
-        <w:rPr>
-          <w:lang/>
-        </w:rPr>
+      <w:r>
         <w:t>n = 0:50;</w:t>
       </w:r>
     </w:p>
     <w:p>
-      <w:pPr>
-        <w:rPr>
-          <w:lang/>
-        </w:rPr>
-      </w:pPr>
-      <w:r>
-        <w:rPr>
-          <w:lang/>
-        </w:rPr>
+      <w:r>
         <w:t>x = 4 * (-0.7).^n .* cos(0.25 * pi * n);</w:t>
       </w:r>
     </w:p>
     <w:p>
-      <w:pPr>
-        <w:rPr>
-          <w:lang/>
-        </w:rPr>
-      </w:pPr>
-      <w:r>
-        <w:rPr>
-          <w:lang/>
-        </w:rPr>
+      <w:r>
         <w:t>X = zeros(size(w));</w:t>
       </w:r>
     </w:p>
     <w:p>
-      <w:pPr>
-        <w:rPr>
-          <w:lang/>
-        </w:rPr>
-      </w:pPr>
-      <w:r>
-        <w:rPr>
-          <w:lang/>
-        </w:rPr>
+      <w:r>
         <w:t>for k = 1:length(w)</w:t>
       </w:r>
     </w:p>
     <w:p>
-      <w:pPr>
-        <w:rPr>
-          <w:lang/>
-        </w:rPr>
-      </w:pPr>
-      <w:r>
-        <w:rPr>
-          <w:lang/>
-        </w:rPr>
+      <w:r>
         <w:t xml:space="preserve">    X(k) = sum(x .* exp(-1j * w(k) * n));</w:t>
       </w:r>
     </w:p>
     <w:p>
-      <w:pPr>
-        <w:rPr>
-          <w:lang/>
-        </w:rPr>
-      </w:pPr>
-      <w:r>
-        <w:rPr>
-          <w:lang/>
-        </w:rPr>
+      <w:r>
         <w:t>end</w:t>
       </w:r>
     </w:p>
     <w:p>
-      <w:pPr>
-        <w:rPr>
-          <w:lang/>
-        </w:rPr>
-      </w:pPr>
-      <w:r>
-        <w:rPr>
-          <w:lang/>
-        </w:rPr>
+      <w:r>
         <w:t xml:space="preserve"> figure(5);</w:t>
       </w:r>
     </w:p>
     <w:p>
-      <w:pPr>
-        <w:rPr>
-          <w:lang/>
-        </w:rPr>
-      </w:pPr>
-      <w:r>
-        <w:rPr>
-          <w:lang/>
-        </w:rPr>
+      <w:r>
         <w:t>subplot(2, 1, 1);</w:t>
       </w:r>
       <w:r>
         <w:t xml:space="preserve"> </w:t>
       </w:r>
       <w:r>
-        <w:rPr>
-          <w:lang/>
-        </w:rPr>
         <w:t>plot(w, abs(X));</w:t>
       </w:r>
       <w:r>
         <w:t xml:space="preserve"> </w:t>
       </w:r>
       <w:r>
-        <w:rPr>
-          <w:lang/>
-        </w:rPr>
         <w:t>title('Magnitude Part');</w:t>
       </w:r>
       <w:r>
         <w:t xml:space="preserve"> </w:t>
       </w:r>
       <w:r>
-        <w:rPr>
-          <w:lang/>
-        </w:rPr>
         <w:t>xlabel('frequency in pi units');</w:t>
       </w:r>
       <w:r>
         <w:t xml:space="preserve"> </w:t>
       </w:r>
       <w:r>
-        <w:rPr>
-          <w:lang/>
-        </w:rPr>
         <w:t>ylabel('Magnitude');</w:t>
       </w:r>
     </w:p>
     <w:p>
-      <w:pPr>
-        <w:rPr>
-          <w:lang/>
-        </w:rPr>
-      </w:pPr>
-      <w:r>
-        <w:rPr>
-          <w:lang/>
-        </w:rPr>
+      <w:r>
         <w:t>subplot(2, 1, 2);</w:t>
       </w:r>
       <w:r>
         <w:t xml:space="preserve"> </w:t>
       </w:r>
       <w:r>
-        <w:rPr>
-          <w:lang/>
-        </w:rPr>
         <w:t>plot(w, angle(X));</w:t>
       </w:r>
       <w:r>
         <w:t xml:space="preserve"> </w:t>
       </w:r>
       <w:r>
-        <w:rPr>
-          <w:lang/>
-        </w:rPr>
         <w:t>title('Phase Part');</w:t>
       </w:r>
       <w:r>
         <w:t xml:space="preserve"> </w:t>
       </w:r>
       <w:r>
-        <w:rPr>
-          <w:lang/>
-        </w:rPr>
         <w:t>xlabel('frequency in pi units');</w:t>
       </w:r>
       <w:r>
         <w:t xml:space="preserve"> </w:t>
       </w:r>
       <w:r>
-        <w:rPr>
-          <w:lang/>
-        </w:rPr>
         <w:t>ylabel('Phase');</w:t>
       </w:r>
     </w:p>
@@ -3136,6 +2109,7 @@
         <w:rPr>
           <w:b/>
           <w:bCs/>
+          <w:noProof/>
         </w:rPr>
         <w:drawing>
           <wp:inline distT="0" distB="0" distL="0" distR="0" wp14:anchorId="36834F4D" wp14:editId="1B19F703">
@@ -3482,6 +2456,7 @@
         <w:rPr>
           <w:b/>
           <w:bCs/>
+          <w:noProof/>
           <w:lang w:val="vi-VN"/>
         </w:rPr>
         <w:drawing>
@@ -3794,35 +2769,108 @@
     </w:p>
     <w:p>
       <w:r>
-        <w:t>subplot(2, 1, 1);</w:t>
-      </w:r>
-      <w:r>
-        <w:t xml:space="preserve"> </w:t>
-      </w:r>
-    </w:p>
-    <w:p>
-      <w:r>
-        <w:t>plot(f, abs(y), 'blue', 'LineWidth', 1, 'MarkerFaceColor', 'blue');</w:t>
-      </w:r>
-      <w:r>
-        <w:t xml:space="preserve"> </w:t>
-      </w:r>
-    </w:p>
-    <w:p>
-      <w:r>
-        <w:t>title('FFT with N\_fft=128');</w:t>
-      </w:r>
-      <w:r>
-        <w:t xml:space="preserve"> </w:t>
+        <w:t xml:space="preserve">subplot(2, 1, 1); </w:t>
+      </w:r>
+    </w:p>
+    <w:p>
+      <w:r>
+        <w:t xml:space="preserve">plot(f, abs(y), 'blue', 'LineWidth', 1, 'MarkerFaceColor', 'blue'); </w:t>
+      </w:r>
+    </w:p>
+    <w:p>
+      <w:r>
+        <w:t xml:space="preserve">title('FFT with N=128'); </w:t>
+      </w:r>
+    </w:p>
+    <w:p>
+      <w:r>
+        <w:t xml:space="preserve">xlabel('Frequency Index'); </w:t>
+      </w:r>
+    </w:p>
+    <w:p>
+      <w:r>
+        <w:t>ylabel('Magnitude');</w:t>
+      </w:r>
+    </w:p>
+    <w:p>
+      <w:r>
+        <w:t xml:space="preserve">subplot(2, 1, 2); </w:t>
+      </w:r>
+    </w:p>
+    <w:p>
+      <w:r>
+        <w:t xml:space="preserve">plot(t, x0, 'red', 'LineWidth', 1, 'MarkerFaceColor', 'red'); </w:t>
+      </w:r>
+    </w:p>
+    <w:p>
+      <w:r>
+        <w:t>title('Time Domain Signal with N=62');</w:t>
+      </w:r>
+    </w:p>
+    <w:p/>
+    <w:p>
+      <w:r>
+        <w:t>% Khi tăng kích thước FFT lên N_fft = 128 (lớn hơn chiều dài tín hiệu), độ phân giải tần số tăng lên, phổ trở nên mịn hơn và các đỉnh tần số rõ ràng hơn. Tuy nhiên, nếu tín hiệu được chèn thêm số 0 (zero-padding), sẽ không có thêm thông tin tần số mới, chỉ làm cho phổ trông liên tục hơn.</w:t>
+      </w:r>
+    </w:p>
+    <w:p/>
+    <w:p>
+      <w:r>
+        <w:t xml:space="preserve">% d. </w:t>
+      </w:r>
+    </w:p>
+    <w:p>
+      <w:r>
+        <w:t>N_fft = 31;</w:t>
+      </w:r>
+    </w:p>
+    <w:p>
+      <w:r>
+        <w:t>t = (0:N_fft - 1) / fs;</w:t>
+      </w:r>
+    </w:p>
+    <w:p>
+      <w:r>
+        <w:t>f = linspace(0, fs, N_fft);</w:t>
+      </w:r>
+    </w:p>
+    <w:p/>
+    <w:p>
+      <w:r>
+        <w:t>x0 = 4 * cos(2 * pi * f0 * t) + 2 * sin(2 * pi * f1 * t);</w:t>
+      </w:r>
+    </w:p>
+    <w:p>
+      <w:r>
+        <w:t>y = fft(x0);</w:t>
+      </w:r>
+    </w:p>
+    <w:p/>
+    <w:p>
+      <w:r>
+        <w:t>figure(4);</w:t>
+      </w:r>
+    </w:p>
+    <w:p>
+      <w:r>
+        <w:t xml:space="preserve">subplot(2, 1, 1); </w:t>
+      </w:r>
+    </w:p>
+    <w:p>
+      <w:r>
+        <w:t xml:space="preserve">plot(f, abs(y), 'blue', 'LineWidth', 1, 'MarkerFaceColor', 'blue'); </w:t>
+      </w:r>
+    </w:p>
+    <w:p>
+      <w:r>
+        <w:lastRenderedPageBreak/>
+        <w:t xml:space="preserve">title('FFT with N=31'); </w:t>
       </w:r>
     </w:p>
     <w:p>
       <w:r>
         <w:t>xlabel('Frequency Index');</w:t>
       </w:r>
-      <w:r>
-        <w:t xml:space="preserve"> </w:t>
-      </w:r>
     </w:p>
     <w:p>
       <w:r>
@@ -3831,132 +2879,17 @@
     </w:p>
     <w:p>
       <w:r>
-        <w:t>subplot(2, 1, 2);</w:t>
-      </w:r>
-      <w:r>
-        <w:t xml:space="preserve"> </w:t>
-      </w:r>
-    </w:p>
-    <w:p>
-      <w:r>
-        <w:t>plot(t, x0, 'red', 'LineWidth', 1, 'MarkerFaceColor', 'red');</w:t>
-      </w:r>
-      <w:r>
-        <w:t xml:space="preserve"> </w:t>
-      </w:r>
-    </w:p>
-    <w:p>
-      <w:r>
-        <w:t>title('Time Domain Signal with N=62');</w:t>
-      </w:r>
-    </w:p>
-    <w:p/>
-    <w:p>
-      <w:r>
-        <w:t>% Khi tăng kích thước FFT lên N_fft = 128 (lớn hơn chiều dài tín hiệu), độ phân giải tần số tăng lên, phổ trở nên mịn hơn và các đỉnh tần số rõ ràng hơn. Tuy nhiên, nếu tín hiệu được chèn thêm số 0 (zero-padding), sẽ không có thêm thông tin tần số mới, chỉ làm cho phổ trông liên tục hơn.</w:t>
-      </w:r>
-    </w:p>
-    <w:p/>
-    <w:p>
-      <w:r>
-        <w:t xml:space="preserve">% d. </w:t>
-      </w:r>
-    </w:p>
-    <w:p>
-      <w:r>
-        <w:t>N_fft = 31;</w:t>
-      </w:r>
-    </w:p>
-    <w:p>
-      <w:r>
-        <w:t>t = (0:N_fft - 1) / fs;</w:t>
-      </w:r>
-    </w:p>
-    <w:p>
-      <w:r>
-        <w:t>f = linspace(0, fs, N_fft);</w:t>
-      </w:r>
-    </w:p>
-    <w:p/>
-    <w:p>
-      <w:r>
-        <w:t>x0 = 4 * cos(2 * pi * f0 * t) + 2 * sin(2 * pi * f1 * t);</w:t>
-      </w:r>
-    </w:p>
-    <w:p>
-      <w:r>
-        <w:t>y = fft(x0);</w:t>
-      </w:r>
-    </w:p>
-    <w:p/>
-    <w:p>
-      <w:r>
-        <w:t>figure(4);</w:t>
-      </w:r>
-    </w:p>
-    <w:p>
-      <w:r>
-        <w:t>subplot(2, 1, 1);</w:t>
-      </w:r>
-      <w:r>
-        <w:t xml:space="preserve"> </w:t>
-      </w:r>
-    </w:p>
-    <w:p>
-      <w:r>
-        <w:t>plot(f, abs(y), 'blue', 'LineWidth', 1, 'MarkerFaceColor', 'blue');</w:t>
-      </w:r>
-      <w:r>
-        <w:t xml:space="preserve"> </w:t>
-      </w:r>
-    </w:p>
-    <w:p>
-      <w:r>
-        <w:lastRenderedPageBreak/>
-        <w:t>title('FFT with N\_fft=31');</w:t>
-      </w:r>
-      <w:r>
-        <w:t xml:space="preserve"> </w:t>
-      </w:r>
-    </w:p>
-    <w:p>
-      <w:r>
-        <w:t>xlabel('Frequency Index');</w:t>
-      </w:r>
-    </w:p>
-    <w:p>
-      <w:r>
-        <w:t xml:space="preserve"> </w:t>
-      </w:r>
-      <w:r>
-        <w:t>ylabel('Magnitude');</w:t>
-      </w:r>
-    </w:p>
-    <w:p>
-      <w:r>
-        <w:t>subplot(2, 1, 2);</w:t>
-      </w:r>
-      <w:r>
-        <w:t xml:space="preserve"> </w:t>
-      </w:r>
-    </w:p>
-    <w:p>
-      <w:r>
-        <w:t>plot(t, x0, 'red', 'LineWidth', 1, 'MarkerFaceColor', 'red');</w:t>
-      </w:r>
-      <w:r>
-        <w:t xml:space="preserve"> </w:t>
-      </w:r>
-    </w:p>
-    <w:p>
-      <w:r>
-        <w:t>title('Time</w:t>
-      </w:r>
-      <w:r>
-        <w:t xml:space="preserve"> </w:t>
-      </w:r>
-      <w:r>
-        <w:t>Domain Signal with N=68');</w:t>
+        <w:t xml:space="preserve">subplot(2, 1, 2); </w:t>
+      </w:r>
+    </w:p>
+    <w:p>
+      <w:r>
+        <w:t xml:space="preserve">plot(t, x0, 'red', 'LineWidth', 1, 'MarkerFaceColor', 'red'); </w:t>
+      </w:r>
+    </w:p>
+    <w:p>
+      <w:r>
+        <w:t>title('Time Domain Signal with N=68');</w:t>
       </w:r>
     </w:p>
     <w:p/>
@@ -3977,6 +2910,7 @@
         <w:rPr>
           <w:b/>
           <w:bCs/>
+          <w:noProof/>
         </w:rPr>
         <w:drawing>
           <wp:inline distT="0" distB="0" distL="0" distR="0" wp14:anchorId="5EE0C65F" wp14:editId="2FE7853B">
@@ -4675,6 +3609,7 @@
   <w:style w:type="character" w:default="1" w:styleId="DefaultParagraphFont">
     <w:name w:val="Default Paragraph Font"/>
     <w:uiPriority w:val="1"/>
+    <w:semiHidden/>
     <w:unhideWhenUsed/>
   </w:style>
   <w:style w:type="table" w:default="1" w:styleId="TableNormal">

</xml_diff>